<commit_message>
docs: priorizar engagement real sobre tamano de audiencia al elegir artistas
Co-Authored-By: Claude Sonnet 5 <noreply@anthropic.com>
Claude-Session: https://claude.ai/code/session_01BGajP5s9F1aLgfyztSAp9Y
</commit_message>
<xml_diff>
--- a/docs/libro/Estrategia_Email_Artistas_Afiliados_IM_Music.docx
+++ b/docs/libro/Estrategia_Email_Artistas_Afiliados_IM_Music.docx
@@ -624,6 +624,134 @@
           <w:sz w:val="22"/>
         </w:rPr>
         <w:t>Prioriza el género/escena donde IM Music ya tiene contexto y lenguaje compartido (urbano, independiente, Latinoamérica) — la propuesta se siente más genuina viniendo de alguien del mismo mundo.</w:t>
+      </w:r>
+    </w:p>
+    <w:p>
+      <w:pPr>
+        <w:spacing w:after="160"/>
+      </w:pPr>
+      <w:r>
+        <w:rPr>
+          <w:rFonts w:ascii="Georgia" w:hAnsi="Georgia"/>
+          <w:b/>
+          <w:color w:val="5E17EB"/>
+          <w:sz w:val="22"/>
+        </w:rPr>
+        <w:t>El filtro más importante de todos: engagement real, no tamaño de audiencia.</w:t>
+      </w:r>
+      <w:r>
+        <w:rPr>
+          <w:rFonts w:ascii="Georgia" w:hAnsi="Georgia"/>
+          <w:sz w:val="22"/>
+        </w:rPr>
+        <w:t xml:space="preserve"> Un artista con 300K seguidores donde la gente comenta, compra su merch y le hace caso a lo que recomienda convierte muchísimo más que uno con 3M de seguidores pasivos que solo scrollean. Antes de escribirle a alguien, revisa:</w:t>
+      </w:r>
+    </w:p>
+    <w:p>
+      <w:pPr>
+        <w:pStyle w:val="ListBullet"/>
+      </w:pPr>
+      <w:r>
+        <w:rPr>
+          <w:rFonts w:ascii="Georgia" w:hAnsi="Georgia"/>
+          <w:b/>
+          <w:color w:val="5E17EB"/>
+          <w:sz w:val="22"/>
+        </w:rPr>
+        <w:t>Tasa de interacción</w:t>
+      </w:r>
+      <w:r>
+        <w:rPr>
+          <w:rFonts w:ascii="Georgia" w:hAnsi="Georgia"/>
+          <w:sz w:val="22"/>
+        </w:rPr>
+        <w:t xml:space="preserve"> — (likes + comentarios) / seguidores en sus últimos 10-15 posts. Si esa proporción es baja, esa audiencia no actúa sobre lo que el artista dice, por más grande que sea.</w:t>
+      </w:r>
+    </w:p>
+    <w:p>
+      <w:pPr>
+        <w:pStyle w:val="ListBullet"/>
+      </w:pPr>
+      <w:r>
+        <w:rPr>
+          <w:rFonts w:ascii="Georgia" w:hAnsi="Georgia"/>
+          <w:b/>
+          <w:color w:val="5E17EB"/>
+          <w:sz w:val="22"/>
+        </w:rPr>
+        <w:t>¿Vende merch propio y le funciona?</w:t>
+      </w:r>
+      <w:r>
+        <w:rPr>
+          <w:rFonts w:ascii="Georgia" w:hAnsi="Georgia"/>
+          <w:sz w:val="22"/>
+        </w:rPr>
+        <w:t xml:space="preserve"> Es la señal más fuerte de que tiene una base dispuesta a gastar por él — el mismo tipo de fan que va a comprar el libro solo porque él lo recomendó.</w:t>
+      </w:r>
+    </w:p>
+    <w:p>
+      <w:pPr>
+        <w:pStyle w:val="ListBullet"/>
+      </w:pPr>
+      <w:r>
+        <w:rPr>
+          <w:rFonts w:ascii="Georgia" w:hAnsi="Georgia"/>
+          <w:b/>
+          <w:color w:val="5E17EB"/>
+          <w:sz w:val="22"/>
+        </w:rPr>
+        <w:t>¿Interactúa él mismo con su audiencia</w:t>
+      </w:r>
+      <w:r>
+        <w:rPr>
+          <w:rFonts w:ascii="Georgia" w:hAnsi="Georgia"/>
+          <w:sz w:val="22"/>
+        </w:rPr>
+        <w:t xml:space="preserve"> (responde comentarios, hace historias con preguntas, etc.)</w:t>
+      </w:r>
+      <w:r>
+        <w:rPr>
+          <w:rFonts w:ascii="Georgia" w:hAnsi="Georgia"/>
+          <w:b/>
+          <w:color w:val="5E17EB"/>
+          <w:sz w:val="22"/>
+        </w:rPr>
+        <w:t>?</w:t>
+      </w:r>
+      <w:r>
+        <w:rPr>
+          <w:rFonts w:ascii="Georgia" w:hAnsi="Georgia"/>
+          <w:sz w:val="22"/>
+        </w:rPr>
+        <w:t xml:space="preserve"> Además de indicar relación real con sus fans, casi siempre significa que su equipo es chico y accesible — vas a poder contactarlo de verdad.</w:t>
+      </w:r>
+    </w:p>
+    <w:p>
+      <w:pPr>
+        <w:spacing w:after="160"/>
+      </w:pPr>
+      <w:r>
+        <w:rPr>
+          <w:rFonts w:ascii="Georgia" w:hAnsi="Georgia"/>
+          <w:sz w:val="22"/>
+        </w:rPr>
+        <w:t xml:space="preserve">En resumen: </w:t>
+      </w:r>
+      <w:r>
+        <w:rPr>
+          <w:rFonts w:ascii="Georgia" w:hAnsi="Georgia"/>
+          <w:b/>
+          <w:color w:val="5E17EB"/>
+          <w:sz w:val="22"/>
+        </w:rPr>
+        <w:t>engagement + base que compra &gt; número de seguidores.</w:t>
+      </w:r>
+      <w:r>
+        <w:rPr>
+          <w:rFonts w:ascii="Georgia" w:hAnsi="Georgia"/>
+          <w:sz w:val="22"/>
+        </w:rPr>
+        <w:t xml:space="preserve"> Ese cruce es lo que de verdad predice si van a lograr ventas reales a través del link, no la fama del artista.</w:t>
       </w:r>
     </w:p>
     <w:p>

</xml_diff>